<commit_message>
Diagrams follow the system: Accounting has a supplier side, Sale Worker does not edit orders, products have no processes and Materials are in Stock, the Dashboard only has order tiles, the Purchase page lists Low or Out materials, no mock in the architecture
Co-Authored-By: Claude Sonnet 5.5 <noreply@anthropic.com>
</commit_message>
<xml_diff>
--- a/docs/ProjectdocInfo/ContextDiagram/Context Diagram.docx
+++ b/docs/ProjectdocInfo/ContextDiagram/Context Diagram.docx
@@ -39,7 +39,7 @@
       <w:r>
         <w:drawing>
           <wp:inline distT="0" distB="0" distL="0" distR="0">
-            <wp:extent cx="7505700" cy="5467350"/>
+            <wp:extent cx="7839075" cy="5467350"/>
             <wp:effectExtent t="0" r="0" b="0" l="0"/>
             <wp:docPr id="1" name="" descr="" title=""/>
             <wp:cNvGraphicFramePr>
@@ -70,7 +70,7 @@
                   <pic:spPr bwMode="auto">
                     <a:xfrm>
                       <a:off x="0" y="0"/>
-                      <a:ext cx="7505700" cy="5467350"/>
+                      <a:ext cx="7839075" cy="5467350"/>
                     </a:xfrm>
                     <a:prstGeom prst="rect">
                       <a:avLst/>
@@ -113,7 +113,7 @@
       <w:r>
         <w:drawing>
           <wp:inline distT="0" distB="0" distL="0" distR="0">
-            <wp:extent cx="9391650" cy="4419600"/>
+            <wp:extent cx="9391650" cy="4371975"/>
             <wp:effectExtent t="0" r="0" b="0" l="0"/>
             <wp:docPr id="1" name="" descr="" title=""/>
             <wp:cNvGraphicFramePr>
@@ -144,7 +144,7 @@
                   <pic:spPr bwMode="auto">
                     <a:xfrm>
                       <a:off x="0" y="0"/>
-                      <a:ext cx="9391650" cy="4419600"/>
+                      <a:ext cx="9391650" cy="4371975"/>
                     </a:xfrm>
                     <a:prstGeom prst="rect">
                       <a:avLst/>
@@ -308,7 +308,7 @@
       <w:r>
         <w:drawing>
           <wp:inline distT="0" distB="0" distL="0" distR="0">
-            <wp:extent cx="5686425" cy="3810000"/>
+            <wp:extent cx="4543425" cy="3810000"/>
             <wp:effectExtent t="0" r="0" b="0" l="0"/>
             <wp:docPr id="1" name="" descr="" title=""/>
             <wp:cNvGraphicFramePr>
@@ -339,7 +339,7 @@
                   <pic:spPr bwMode="auto">
                     <a:xfrm>
                       <a:off x="0" y="0"/>
-                      <a:ext cx="5686425" cy="3810000"/>
+                      <a:ext cx="4543425" cy="3810000"/>
                     </a:xfrm>
                     <a:prstGeom prst="rect">
                       <a:avLst/>
@@ -362,7 +362,7 @@
           <w:sz w:val="18"/>
           <w:szCs w:val="18"/>
         </w:rPr>
-        <w:t xml:space="preserve">Figure 5. Level 1: architecture (frontend: pages, PDF print, mock API; backend: REST API, file storage, MySQL)</w:t>
+        <w:t xml:space="preserve">Figure 5. Level 1: architecture (frontend: pages, PDF print; backend: REST API, file storage, MySQL)</w:t>
       </w:r>
     </w:p>
     <w:p>
@@ -655,7 +655,7 @@
                 <w:sz w:val="18"/>
                 <w:szCs w:val="18"/>
               </w:rPr>
-              <w:t xml:space="preserve">QT, customer PO file, order edits</w:t>
+              <w:t xml:space="preserve">QT, customer PO file</w:t>
             </w:r>
           </w:p>
         </w:tc>
@@ -1216,7 +1216,7 @@
         <w:spacing w:after="120"/>
       </w:pPr>
       <w:r>
-        <w:t xml:space="preserve">Sales orders, delivery, supplier invoices in Accounting, serial numbers and tax.</w:t>
+        <w:t xml:space="preserve">Sales orders, delivery, supplier invoices, serial numbers and tax. (The Accounting page also lists the received purchase orders that wait for payment and the ones that are paid; the payment is recorded on the PO.)</w:t>
       </w:r>
     </w:p>
     <w:sectPr>

</xml_diff>

<commit_message>
Context Diagram level 0: classic look (plain boxes, a 0 band, corner entities with one turn, nested lines)
Co-Authored-By: Claude Sonnet 5.5 <noreply@anthropic.com>
</commit_message>
<xml_diff>
--- a/docs/ProjectdocInfo/ContextDiagram/Context Diagram.docx
+++ b/docs/ProjectdocInfo/ContextDiagram/Context Diagram.docx
@@ -39,7 +39,7 @@
       <w:r>
         <w:drawing>
           <wp:inline distT="0" distB="0" distL="0" distR="0">
-            <wp:extent cx="7839075" cy="5467350"/>
+            <wp:extent cx="8458200" cy="5467350"/>
             <wp:effectExtent t="0" r="0" b="0" l="0"/>
             <wp:docPr id="1" name="" descr="" title=""/>
             <wp:cNvGraphicFramePr>
@@ -70,7 +70,7 @@
                   <pic:spPr bwMode="auto">
                     <a:xfrm>
                       <a:off x="0" y="0"/>
-                      <a:ext cx="7839075" cy="5467350"/>
+                      <a:ext cx="8458200" cy="5467350"/>
                     </a:xfrm>
                     <a:prstGeom prst="rect">
                       <a:avLst/>

</xml_diff>